<commit_message>
updated final project documents
uploading final project documents
</commit_message>
<xml_diff>
--- a/Specialized Models _ Time Series and Survival Analysis (IBM Course)/Final Project/Project Assignment __ Time Series Models for Walmart Sales Forecast.docx
+++ b/Specialized Models _ Time Series and Survival Analysis (IBM Course)/Final Project/Project Assignment __ Time Series Models for Walmart Sales Forecast.docx
@@ -80,17 +80,20 @@
           <w:szCs w:val="21"/>
           <w:shd w:val="clear" w:color="auto" w:fill="FFFFFF"/>
         </w:rPr>
-        <w:t xml:space="preserve">One challenge of </w:t>
-      </w:r>
-      <w:r>
+        <w:t>One challenge of modelling retail data is the need to make decisions based on limited history. If Christmas comes but once a year, so does the chance to see how strategic decisions impacted the bottom line.</w:t>
+      </w:r>
+    </w:p>
+    <w:p>
+      <w:pPr>
+        <w:spacing w:before="120" w:after="120" w:line="240" w:lineRule="auto"/>
+        <w:jc w:val="both"/>
         <w:rPr>
           <w:rFonts w:ascii="Segoe UI" w:hAnsi="Segoe UI" w:cs="Segoe UI"/>
           <w:sz w:val="21"/>
           <w:szCs w:val="21"/>
           <w:shd w:val="clear" w:color="auto" w:fill="FFFFFF"/>
         </w:rPr>
-        <w:t>modelling</w:t>
-      </w:r>
+      </w:pPr>
       <w:r>
         <w:rPr>
           <w:rFonts w:ascii="Segoe UI" w:hAnsi="Segoe UI" w:cs="Segoe UI"/>
@@ -98,7 +101,7 @@
           <w:szCs w:val="21"/>
           <w:shd w:val="clear" w:color="auto" w:fill="FFFFFF"/>
         </w:rPr>
-        <w:t xml:space="preserve"> retail data is the need to make decisions based on limited history. If Christmas comes but once a year, so does the chance to see how strategic decisions impacted the bottom line.</w:t>
+        <w:t>The purpose of this analysis is to use an appropriate(limited) data from a retail store to predict the extent of impact of key holidays/events on the sales of a certain category of products.</w:t>
       </w:r>
     </w:p>
     <w:p>
@@ -119,46 +122,7 @@
           <w:szCs w:val="21"/>
           <w:shd w:val="clear" w:color="auto" w:fill="FFFFFF"/>
         </w:rPr>
-        <w:t>The purpose of this analysis is to use an appropriate(limited) data from a retail store to predict the extent of impact of key holidays/events on the sales of a certain category of products.</w:t>
-      </w:r>
-    </w:p>
-    <w:p>
-      <w:pPr>
-        <w:spacing w:before="120" w:after="120" w:line="240" w:lineRule="auto"/>
-        <w:jc w:val="both"/>
-        <w:rPr>
-          <w:rFonts w:ascii="Segoe UI" w:hAnsi="Segoe UI" w:cs="Segoe UI"/>
-          <w:sz w:val="21"/>
-          <w:szCs w:val="21"/>
-          <w:shd w:val="clear" w:color="auto" w:fill="FFFFFF"/>
-        </w:rPr>
-      </w:pPr>
-      <w:r>
-        <w:rPr>
-          <w:rFonts w:ascii="Segoe UI" w:hAnsi="Segoe UI" w:cs="Segoe UI"/>
-          <w:sz w:val="21"/>
-          <w:szCs w:val="21"/>
-          <w:shd w:val="clear" w:color="auto" w:fill="FFFFFF"/>
-        </w:rPr>
-        <w:t xml:space="preserve">Keeping the above objective in mind, the results can be evaluated using Weighted Mean Absolute </w:t>
-      </w:r>
-      <w:r>
-        <w:rPr>
-          <w:rFonts w:ascii="Segoe UI" w:hAnsi="Segoe UI" w:cs="Segoe UI"/>
-          <w:sz w:val="21"/>
-          <w:szCs w:val="21"/>
-          <w:shd w:val="clear" w:color="auto" w:fill="FFFFFF"/>
-        </w:rPr>
-        <w:t>Error (</w:t>
-      </w:r>
-      <w:r>
-        <w:rPr>
-          <w:rFonts w:ascii="Segoe UI" w:hAnsi="Segoe UI" w:cs="Segoe UI"/>
-          <w:sz w:val="21"/>
-          <w:szCs w:val="21"/>
-          <w:shd w:val="clear" w:color="auto" w:fill="FFFFFF"/>
-        </w:rPr>
-        <w:t>WMAE) where holiday week will have weight of 5 and rest will have a weight of 1.</w:t>
+        <w:t>Keeping the above objective in mind, the results can be evaluated using Weighted Mean Absolute Error (WMAE) where holiday week will have weight of 5 and rest will have a weight of 1.</w:t>
       </w:r>
     </w:p>
     <w:p>
@@ -430,40 +394,16 @@
         <w:jc w:val="both"/>
       </w:pPr>
       <w:r>
-        <w:t xml:space="preserve">The planned approach is to first have an idea of the available input variables and do any </w:t>
-      </w:r>
-      <w:r>
-        <w:t>pre-processing</w:t>
-      </w:r>
-      <w:r>
-        <w:t xml:space="preserve"> required to prepare the time-series data. Next, we analyse the time-series data for any available patterns of seasonality, trend and autocorrelation. If there is a non-stationary </w:t>
-      </w:r>
-      <w:r>
-        <w:t>series,</w:t>
-      </w:r>
-      <w:r>
-        <w:t xml:space="preserve"> we convert it to stationary and do the relevant statistical tests.</w:t>
-      </w:r>
-    </w:p>
-    <w:p>
-      <w:pPr>
-        <w:spacing w:before="120" w:after="120" w:line="240" w:lineRule="auto"/>
-        <w:jc w:val="both"/>
-      </w:pPr>
-      <w:r>
-        <w:t xml:space="preserve">The algorithms we will be using for our purpose are time-series Decomposition, </w:t>
-      </w:r>
-      <w:r>
-        <w:t>Exponential Smoothing, ARIMA (</w:t>
-      </w:r>
-      <w:r>
-        <w:t>AR/MA etc as needed based on analysis), SARIMAX</w:t>
-      </w:r>
-      <w:r>
-        <w:t xml:space="preserve"> and Prophet</w:t>
-      </w:r>
-      <w:r>
-        <w:t>.</w:t>
+        <w:t>The planned approach is to first have an idea of the available input variables and do any pre-processing required to prepare the time-series data. Next, we analyse the time-series data for any available patterns of seasonality, trend and autocorrelation. If there is a non-stationary series, we convert it to stationary and do the relevant statistical tests.</w:t>
+      </w:r>
+    </w:p>
+    <w:p>
+      <w:pPr>
+        <w:spacing w:before="120" w:after="120" w:line="240" w:lineRule="auto"/>
+        <w:jc w:val="both"/>
+      </w:pPr>
+      <w:r>
+        <w:t>The algorithms we will be using for our purpose are time-series Decomposition, Exponential Smoothing, ARIMA (AR/MA etc as needed based on analysis), SARIMAX and Prophet.</w:t>
       </w:r>
     </w:p>
     <w:p>
@@ -484,10 +424,7 @@
         <w:pStyle w:val="Heading2"/>
       </w:pPr>
       <w:r>
-        <w:t xml:space="preserve">Data </w:t>
-      </w:r>
-      <w:r>
-        <w:t>Preparation</w:t>
+        <w:t>Data Preparation</w:t>
       </w:r>
     </w:p>
     <w:p>
@@ -578,7 +515,15 @@
         <w:jc w:val="both"/>
       </w:pPr>
       <w:r>
-        <w:t>As per our requirement, we pivot the dataset and arrive at a data with all time series columns that we need to predict. The index frequency is set to weekly and its split into train : test with ratio 80:20. Train data has &gt;2 years of data and test has &gt;6 months of data. Holidays list is also extracted and kept separately for our future use.</w:t>
+        <w:t xml:space="preserve">As per our requirement, we pivot the dataset and arrive at a data with all time series columns that we need to predict. The index frequency is set to weekly and its split into </w:t>
+      </w:r>
+      <w:proofErr w:type="gramStart"/>
+      <w:r>
+        <w:t>train :</w:t>
+      </w:r>
+      <w:proofErr w:type="gramEnd"/>
+      <w:r>
+        <w:t xml:space="preserve"> test with ratio 80:20. Train data has &gt;2 years of data and test has &gt;6 months of data. Holidays list is also extracted and kept separately for our future use.</w:t>
       </w:r>
     </w:p>
     <w:p>
@@ -704,10 +649,7 @@
         <w:pStyle w:val="Heading2"/>
       </w:pPr>
       <w:r>
-        <w:t>Time Series</w:t>
-      </w:r>
-      <w:r>
-        <w:t xml:space="preserve"> Exploration</w:t>
+        <w:t>Time Series Exploration</w:t>
       </w:r>
     </w:p>
     <w:p>
@@ -834,19 +776,7 @@
         <w:jc w:val="both"/>
       </w:pPr>
       <w:r>
-        <w:t>From the</w:t>
-      </w:r>
-      <w:r>
-        <w:t>se</w:t>
-      </w:r>
-      <w:r>
-        <w:t xml:space="preserve"> plots we </w:t>
-      </w:r>
-      <w:r>
-        <w:t>conclude that</w:t>
-      </w:r>
-      <w:r>
-        <w:t xml:space="preserve"> April has outlier value for the third year which causes quarter 2 values to vary a lot in almost all of the stores. For some of the stores there seems to be a pattern of growing sales going from January to December.</w:t>
+        <w:t>From these plots we conclude that April has outlier value for the third year which causes quarter 2 values to vary a lot in almost all of the stores. For some of the stores there seems to be a pattern of growing sales going from January to December.</w:t>
       </w:r>
     </w:p>
     <w:p>
@@ -984,49 +914,16 @@
         <w:jc w:val="both"/>
       </w:pPr>
       <w:r>
-        <w:t>These plots lead us to conclude that t</w:t>
-      </w:r>
-      <w:r>
-        <w:t>he non-stationary</w:t>
-      </w:r>
-      <w:r>
-        <w:t xml:space="preserve"> time series</w:t>
-      </w:r>
-      <w:r>
-        <w:t xml:space="preserve"> have slight trend in some cases and heteroscedasticity in almost all the cases which could be due to the seasonality. For these stores, we can try additive seasonal decomposition method with annual seasonality.</w:t>
-      </w:r>
-    </w:p>
-    <w:p>
-      <w:pPr>
-        <w:spacing w:before="120" w:after="120" w:line="240" w:lineRule="auto"/>
-        <w:jc w:val="both"/>
-      </w:pPr>
-      <w:r>
-        <w:t>The time-series that are stationary</w:t>
-      </w:r>
-      <w:r>
-        <w:t xml:space="preserve"> </w:t>
-      </w:r>
-      <w:r>
-        <w:t>(as per ADF test) have a stable mean; pretty much normal distribution with some outliers</w:t>
-      </w:r>
-      <w:r>
-        <w:t xml:space="preserve"> </w:t>
-      </w:r>
-      <w:r>
-        <w:t xml:space="preserve">(perhaps also resulting in unstable variance). In these </w:t>
-      </w:r>
-      <w:r>
-        <w:t>cases,</w:t>
-      </w:r>
-      <w:r>
-        <w:t xml:space="preserve"> heteroscedasticity could be from these outliers</w:t>
-      </w:r>
-      <w:r>
-        <w:t xml:space="preserve"> or from possible weekly/monthly seasonality</w:t>
-      </w:r>
-      <w:r>
-        <w:t>.</w:t>
+        <w:t>These plots lead us to conclude that the non-stationary time series have slight trend in some cases and heteroscedasticity in almost all the cases which could be due to the seasonality. For these stores, we can try additive seasonal decomposition method with annual seasonality.</w:t>
+      </w:r>
+    </w:p>
+    <w:p>
+      <w:pPr>
+        <w:spacing w:before="120" w:after="120" w:line="240" w:lineRule="auto"/>
+        <w:jc w:val="both"/>
+      </w:pPr>
+      <w:r>
+        <w:t>The time-series that are stationary (as per ADF test) have a stable mean; pretty much normal distribution with some outliers (perhaps also resulting in unstable variance). In these cases, heteroscedasticity could be from these outliers or from possible weekly/monthly seasonality.</w:t>
       </w:r>
     </w:p>
     <w:p>
@@ -1192,10 +1089,7 @@
         <w:pStyle w:val="Heading2"/>
       </w:pPr>
       <w:r>
-        <w:t xml:space="preserve">Time Series </w:t>
-      </w:r>
-      <w:r>
-        <w:t>Model – Triple Exponential Smoothing</w:t>
+        <w:t>Time Series Model – Triple Exponential Smoothing</w:t>
       </w:r>
     </w:p>
     <w:p>
@@ -1270,10 +1164,7 @@
         <w:t xml:space="preserve"> </w:t>
       </w:r>
       <w:r>
-        <w:t>A few experiments</w:t>
-      </w:r>
-      <w:r>
-        <w:t xml:space="preserve"> quickly give an indication of better predictability with monthly and even half-yearly seasonality.</w:t>
+        <w:t>A few experiments quickly give an indication of better predictability with monthly and even half-yearly seasonality.</w:t>
       </w:r>
     </w:p>
     <w:p>
@@ -1291,7 +1182,15 @@
         <w:t xml:space="preserve">(52, 26, 4). </w:t>
       </w:r>
       <w:r>
-        <w:t>In some cases it does a good job predicting the sales curve(along with occasional high) but not for all the stores as we can see below.</w:t>
+        <w:t xml:space="preserve">In some cases it does a good job predicting the sales </w:t>
+      </w:r>
+      <w:proofErr w:type="gramStart"/>
+      <w:r>
+        <w:t>curve(</w:t>
+      </w:r>
+      <w:proofErr w:type="gramEnd"/>
+      <w:r>
+        <w:t>along with occasional high) but not for all the stores as we can see below.</w:t>
       </w:r>
     </w:p>
     <w:p>
@@ -1396,31 +1295,7 @@
         <w:jc w:val="both"/>
       </w:pPr>
       <w:r>
-        <w:t xml:space="preserve">The 3 exponential smoothing models have only one difference and that is seasonality. It seems there are some stores which have always high errors. </w:t>
-      </w:r>
-      <w:r>
-        <w:t>It’s</w:t>
-      </w:r>
-      <w:r>
-        <w:t xml:space="preserve"> possible that these stores have high sale values as well. For the rest, most of the times monthly seasonality </w:t>
-      </w:r>
-      <w:r>
-        <w:t>results</w:t>
-      </w:r>
-      <w:r>
-        <w:t xml:space="preserve"> in much higher error than the </w:t>
-      </w:r>
-      <w:r>
-        <w:t>rest (</w:t>
-      </w:r>
-      <w:r>
-        <w:t xml:space="preserve">especially, store 14 onwards). In other cases, all 3 are quite </w:t>
-      </w:r>
-      <w:r>
-        <w:t>comparable (</w:t>
-      </w:r>
-      <w:r>
-        <w:t>store 1-6, 8-14).</w:t>
+        <w:t>The 3 exponential smoothing models have only one difference and that is seasonality. It seems there are some stores which have always high errors. It’s possible that these stores have high sale values as well. For the rest, most of the times monthly seasonality results in much higher error than the rest (especially, store 14 onwards). In other cases, all 3 are quite comparable (store 1-6, 8-14).</w:t>
       </w:r>
     </w:p>
     <w:p>
@@ -1500,10 +1375,7 @@
         <w:pStyle w:val="Heading2"/>
       </w:pPr>
       <w:r>
-        <w:t xml:space="preserve">Time Series Model – </w:t>
-      </w:r>
-      <w:r>
-        <w:t>SARIMA models using auto-arima</w:t>
+        <w:t>Time Series Model – SARIMA models using auto-arima</w:t>
       </w:r>
     </w:p>
     <w:p>
@@ -1582,40 +1454,24 @@
         <w:jc w:val="both"/>
       </w:pPr>
       <w:r>
-        <w:t>Using the stepwise model search and e</w:t>
-      </w:r>
-      <w:r>
-        <w:t xml:space="preserve">xperimenting a bit with above </w:t>
-      </w:r>
-      <w:r>
-        <w:t xml:space="preserve">code </w:t>
-      </w:r>
-      <w:r>
-        <w:t>suggest</w:t>
-      </w:r>
-      <w:r>
-        <w:t>s</w:t>
-      </w:r>
-      <w:r>
-        <w:t xml:space="preserve"> that m=12(monthly seasonality) and m=4(qua</w:t>
-      </w:r>
-      <w:r>
-        <w:t>r</w:t>
-      </w:r>
-      <w:r>
-        <w:t>terly seasonality) are better than m=1(annual seasonality) which fails to capture any variation in the series.</w:t>
-      </w:r>
-    </w:p>
-    <w:p>
-      <w:pPr>
-        <w:spacing w:before="120" w:after="120" w:line="240" w:lineRule="auto"/>
-        <w:jc w:val="both"/>
-      </w:pPr>
-      <w:r>
-        <w:t>Residuals are deviating from normality at extremes which could perhaps be fixed through log transformations.</w:t>
-      </w:r>
-      <w:r>
-        <w:t xml:space="preserve"> A suggestion to keep in mind for future.</w:t>
+        <w:t xml:space="preserve">Using the stepwise model search and experimenting a bit with above code suggests that m=12(monthly seasonality) and m=4(quarterly seasonality) </w:t>
+      </w:r>
+      <w:proofErr w:type="gramStart"/>
+      <w:r>
+        <w:t>are</w:t>
+      </w:r>
+      <w:proofErr w:type="gramEnd"/>
+      <w:r>
+        <w:t xml:space="preserve"> better than m=1(annual seasonality) which fails to capture any variation in the series.</w:t>
+      </w:r>
+    </w:p>
+    <w:p>
+      <w:pPr>
+        <w:spacing w:before="120" w:after="120" w:line="240" w:lineRule="auto"/>
+        <w:jc w:val="both"/>
+      </w:pPr>
+      <w:r>
+        <w:t>Residuals are deviating from normality at extremes which could perhaps be fixed through log transformations. A suggestion to keep in mind for future.</w:t>
       </w:r>
     </w:p>
     <w:p>
@@ -1784,25 +1640,7 @@
         <w:jc w:val="both"/>
       </w:pPr>
       <w:r>
-        <w:t xml:space="preserve">The new </w:t>
-      </w:r>
-      <w:r>
-        <w:t>SARIMA</w:t>
-      </w:r>
-      <w:r>
-        <w:t xml:space="preserve"> models we just added have very high errors. Perhaps log transform</w:t>
-      </w:r>
-      <w:r>
-        <w:t xml:space="preserve"> </w:t>
-      </w:r>
-      <w:r>
-        <w:t>would have reduced variations by some degree</w:t>
-      </w:r>
-      <w:r>
-        <w:t xml:space="preserve"> or changing P and Q as mentioned above</w:t>
-      </w:r>
-      <w:r>
-        <w:t>.</w:t>
+        <w:t>The new SARIMA models we just added have very high errors. Perhaps log transform would have reduced variations by some degree or changing P and Q as mentioned above.</w:t>
       </w:r>
     </w:p>
     <w:p>
@@ -1823,28 +1661,16 @@
         <w:pStyle w:val="Heading2"/>
       </w:pPr>
       <w:r>
-        <w:t xml:space="preserve">Time Series Model – </w:t>
-      </w:r>
-      <w:r>
-        <w:t>Prophet</w:t>
-      </w:r>
-    </w:p>
-    <w:p>
-      <w:pPr>
-        <w:spacing w:before="120" w:after="120" w:line="240" w:lineRule="auto"/>
-        <w:jc w:val="both"/>
-      </w:pPr>
-      <w:r>
-        <w:t xml:space="preserve">We use </w:t>
-      </w:r>
-      <w:r>
-        <w:t>prophet</w:t>
-      </w:r>
-      <w:r>
-        <w:t xml:space="preserve"> library</w:t>
-      </w:r>
-      <w:r>
-        <w:t xml:space="preserve"> from </w:t>
+        <w:t>Time Series Model – Prophet</w:t>
+      </w:r>
+    </w:p>
+    <w:p>
+      <w:pPr>
+        <w:spacing w:before="120" w:after="120" w:line="240" w:lineRule="auto"/>
+        <w:jc w:val="both"/>
+      </w:pPr>
+      <w:r>
+        <w:t xml:space="preserve">We use prophet library from </w:t>
       </w:r>
       <w:r>
         <w:t>Facebook</w:t>
@@ -2139,19 +1965,7 @@
         <w:rPr>
           <w:noProof/>
         </w:rPr>
-        <w:t xml:space="preserve">Prophet without monthly </w:t>
-      </w:r>
-      <w:r>
-        <w:rPr>
-          <w:noProof/>
-        </w:rPr>
-        <w:t xml:space="preserve">seasonality </w:t>
-      </w:r>
-      <w:r>
-        <w:rPr>
-          <w:noProof/>
-        </w:rPr>
-        <w:t>has below sample outputs. This shows how some patterns are easily captured (store 17) while some are not(store 20). The store 20 might have frequent changes owing to monthly seasonality so it might help to train prophet with monthly seasonality for such series.</w:t>
+        <w:t>Prophet without monthly seasonality has below sample outputs. This shows how some patterns are easily captured (store 17) while some are not(store 20). The store 20 might have frequent changes owing to monthly seasonality so it might help to train prophet with monthly seasonality for such series.</w:t>
       </w:r>
     </w:p>
     <w:p>
@@ -2685,13 +2499,7 @@
         <w:jc w:val="both"/>
       </w:pPr>
       <w:r>
-        <w:t xml:space="preserve">We can still make several improvements to </w:t>
-      </w:r>
-      <w:r>
-        <w:t>each of the models</w:t>
-      </w:r>
-      <w:r>
-        <w:t xml:space="preserve"> trained above. Below are some of the ideas for improvement.</w:t>
+        <w:t>We can still make several improvements to each of the models trained above. Below are some of the ideas for improvement.</w:t>
       </w:r>
     </w:p>
     <w:p>
@@ -2705,13 +2513,7 @@
         <w:jc w:val="both"/>
       </w:pPr>
       <w:r>
-        <w:t>Train Exponential Smoothing &amp; auto-arima on log transform and/or train it on exogenous variables to improve result. Log transformation will deal with outliers and exogenous variabl</w:t>
-      </w:r>
-      <w:r>
-        <w:t>e</w:t>
-      </w:r>
-      <w:r>
-        <w:t>s will add more info to train the models on.</w:t>
+        <w:t>Train Exponential Smoothing &amp; auto-arima on log transform and/or train it on exogenous variables to improve result. Log transformation will deal with outliers and exogenous variables will add more info to train the models on.</w:t>
       </w:r>
     </w:p>
     <w:p>
@@ -2725,25 +2527,7 @@
         <w:jc w:val="both"/>
       </w:pPr>
       <w:r>
-        <w:t xml:space="preserve">Use linear Regression on trend, </w:t>
-      </w:r>
-      <w:r>
-        <w:t>Fourier</w:t>
-      </w:r>
-      <w:r>
-        <w:t xml:space="preserve"> components</w:t>
-      </w:r>
-      <w:r>
-        <w:t xml:space="preserve"> </w:t>
-      </w:r>
-      <w:r>
-        <w:t xml:space="preserve">(coupled with periodograms) on seasonality &amp; </w:t>
-      </w:r>
-      <w:r>
-        <w:t>ARMA</w:t>
-      </w:r>
-      <w:r>
-        <w:t xml:space="preserve"> on stationary residuals to make the most of decomposition components.</w:t>
+        <w:t>Use linear Regression on trend, Fourier components (coupled with periodograms) on seasonality &amp; ARMA on stationary residuals to make the most of decomposition components.</w:t>
       </w:r>
     </w:p>
     <w:p>
@@ -2840,11 +2624,71 @@
         <w:rPr>
           <w:noProof/>
         </w:rPr>
+        <w:t xml:space="preserve">Project </w:t>
+      </w:r>
+      <w:r>
+        <w:rPr>
+          <w:noProof/>
+        </w:rPr>
         <w:t>Code :</w:t>
       </w:r>
       <w:r>
         <w:t xml:space="preserve"> </w:t>
       </w:r>
+      <w:hyperlink r:id="rId31" w:history="1">
+        <w:r>
+          <w:rPr>
+            <w:rStyle w:val="Hyperlink"/>
+          </w:rPr>
+          <w:t xml:space="preserve">Python-QuickStart-Codes---Stats-ML-DL-AI-NLP/Time Series Models for Walmart Sales </w:t>
+        </w:r>
+        <w:proofErr w:type="spellStart"/>
+        <w:r>
+          <w:rPr>
+            <w:rStyle w:val="Hyperlink"/>
+          </w:rPr>
+          <w:t>Forecast.ipynb</w:t>
+        </w:r>
+        <w:proofErr w:type="spellEnd"/>
+        <w:r>
+          <w:rPr>
+            <w:rStyle w:val="Hyperlink"/>
+          </w:rPr>
+          <w:t xml:space="preserve"> at main · </w:t>
+        </w:r>
+        <w:proofErr w:type="spellStart"/>
+        <w:r>
+          <w:rPr>
+            <w:rStyle w:val="Hyperlink"/>
+          </w:rPr>
+          <w:t>quickSilverShanks</w:t>
+        </w:r>
+        <w:proofErr w:type="spellEnd"/>
+        <w:r>
+          <w:rPr>
+            <w:rStyle w:val="Hyperlink"/>
+          </w:rPr>
+          <w:t>/Python-QuickStart-Codes---Stats-ML-DL-AI-NLP (github.com)</w:t>
+        </w:r>
+      </w:hyperlink>
+    </w:p>
+    <w:p>
+      <w:pPr>
+        <w:spacing w:before="120" w:after="120" w:line="240" w:lineRule="auto"/>
+        <w:jc w:val="both"/>
+        <w:rPr>
+          <w:noProof/>
+        </w:rPr>
+      </w:pPr>
+    </w:p>
+    <w:p>
+      <w:pPr>
+        <w:spacing w:before="120" w:after="120" w:line="240" w:lineRule="auto"/>
+        <w:jc w:val="both"/>
+        <w:rPr>
+          <w:noProof/>
+        </w:rPr>
+      </w:pPr>
     </w:p>
     <w:sectPr>
       <w:pgSz w:w="11906" w:h="16838"/>
@@ -3770,6 +3614,7 @@
   <w:style w:type="character" w:default="1" w:styleId="DefaultParagraphFont">
     <w:name w:val="Default Paragraph Font"/>
     <w:uiPriority w:val="1"/>
+    <w:semiHidden/>
     <w:unhideWhenUsed/>
   </w:style>
   <w:style w:type="table" w:default="1" w:styleId="TableNormal">

</xml_diff>